<commit_message>
Wording fixes from the CEO-lens read-through
Two independent readers read every question as the CEO of J.P. Morgan Private
Bank; this carries the fixes both agreed on (live as analyst-survey PR #31):
2.1 says it is five years after launch; 1.4 and 2.3 tell the central team from
the specialist; 3.2, 3.3 and 5.1-5.2a hint fixes; 6.2b, 6.3, 7.1, 8.1a, 8.4a,
9.2 and 9.4a wording. The Word documents and the database seed are rebuilt.

Co-Authored-By: Claude Opus 5.5 (1M context) <noreply@anthropic.com>
</commit_message>
<xml_diff>
--- a/data-spec/Ceres database hand-over.docx
+++ b/data-spec/Ceres database hand-over.docx
@@ -19481,7 +19481,7 @@
               <w:rPr>
                 <w:sz w:val="16"/>
               </w:rPr>
-              <w:t>Three years after launch, how much of a client's contact with us will happen without a …</w:t>
+              <w:t>Three years after launch, what share of a client's requests and transactions will be …</w:t>
             </w:r>
           </w:p>
         </w:tc>
@@ -20505,7 +20505,7 @@
               <w:rPr>
                 <w:sz w:val="16"/>
               </w:rPr>
-              <w:t>If we could pay for only one of these, which one?</w:t>
+              <w:t>If we could make only one of these changes, which one?</w:t>
             </w:r>
           </w:p>
         </w:tc>
@@ -21630,7 +21630,7 @@
               <w:rPr>
                 <w:sz w:val="16"/>
               </w:rPr>
-              <w:t>Where does J.P. Morgan stand on each of these today?</w:t>
+              <w:t>Where does the IPB stand on each of these today?</w:t>
             </w:r>
           </w:p>
         </w:tc>

</xml_diff>